<commit_message>
fix(statement-of-account): insert SOA.docx merge placeholders, fall back to real disbursement date
Template had no merge tags yet (ADR-052 §6) - inserted them in Word, including
the RemainingSchedule table-row loop. LoanDate now falls back to
LoanAccount.activatedAt when anticipatedDisbursementDate isn't set, since many
legacy loans never got that field populated.
</commit_message>
<xml_diff>
--- a/app/backend/templates/SOA.docx
+++ b/app/backend/templates/SOA.docx
@@ -158,6 +158,32 @@
                 <w:szCs w:val="18"/>
               </w:rPr>
             </w:pPr>
+            <w:r>
+              <w:rPr>
+                <w:rFonts w:ascii="Arial" w:hAnsi="Arial" w:cs="Arial"/>
+                <w:sz w:val="18"/>
+                <w:szCs w:val="18"/>
+              </w:rPr>
+              <w:t>{</w:t>
+            </w:r>
+            <w:proofErr w:type="spellStart"/>
+            <w:r>
+              <w:rPr>
+                <w:rFonts w:ascii="Arial" w:hAnsi="Arial" w:cs="Arial"/>
+                <w:sz w:val="18"/>
+                <w:szCs w:val="18"/>
+              </w:rPr>
+              <w:t>StatementDate</w:t>
+            </w:r>
+            <w:proofErr w:type="spellEnd"/>
+            <w:r>
+              <w:rPr>
+                <w:rFonts w:ascii="Arial" w:hAnsi="Arial" w:cs="Arial"/>
+                <w:sz w:val="18"/>
+                <w:szCs w:val="18"/>
+              </w:rPr>
+              <w:t>}</w:t>
+            </w:r>
           </w:p>
         </w:tc>
         <w:tc>
@@ -291,6 +317,32 @@
                 <w:szCs w:val="18"/>
               </w:rPr>
             </w:pPr>
+            <w:r>
+              <w:rPr>
+                <w:rFonts w:ascii="Arial" w:hAnsi="Arial" w:cs="Arial"/>
+                <w:sz w:val="18"/>
+                <w:szCs w:val="18"/>
+              </w:rPr>
+              <w:t>{</w:t>
+            </w:r>
+            <w:proofErr w:type="spellStart"/>
+            <w:r>
+              <w:rPr>
+                <w:rFonts w:ascii="Arial" w:hAnsi="Arial" w:cs="Arial"/>
+                <w:sz w:val="18"/>
+                <w:szCs w:val="18"/>
+              </w:rPr>
+              <w:t>BorrowerName</w:t>
+            </w:r>
+            <w:proofErr w:type="spellEnd"/>
+            <w:r>
+              <w:rPr>
+                <w:rFonts w:ascii="Arial" w:hAnsi="Arial" w:cs="Arial"/>
+                <w:sz w:val="18"/>
+                <w:szCs w:val="18"/>
+              </w:rPr>
+              <w:t>}</w:t>
+            </w:r>
           </w:p>
         </w:tc>
         <w:tc>
@@ -369,6 +421,32 @@
                 <w:szCs w:val="18"/>
               </w:rPr>
             </w:pPr>
+            <w:r>
+              <w:rPr>
+                <w:rFonts w:ascii="Arial" w:hAnsi="Arial" w:cs="Arial"/>
+                <w:sz w:val="18"/>
+                <w:szCs w:val="18"/>
+              </w:rPr>
+              <w:t>{</w:t>
+            </w:r>
+            <w:proofErr w:type="spellStart"/>
+            <w:r>
+              <w:rPr>
+                <w:rFonts w:ascii="Arial" w:hAnsi="Arial" w:cs="Arial"/>
+                <w:sz w:val="18"/>
+                <w:szCs w:val="18"/>
+              </w:rPr>
+              <w:t>BorrowerAddress</w:t>
+            </w:r>
+            <w:proofErr w:type="spellEnd"/>
+            <w:r>
+              <w:rPr>
+                <w:rFonts w:ascii="Arial" w:hAnsi="Arial" w:cs="Arial"/>
+                <w:sz w:val="18"/>
+                <w:szCs w:val="18"/>
+              </w:rPr>
+              <w:t>}</w:t>
+            </w:r>
           </w:p>
         </w:tc>
         <w:tc>
@@ -501,6 +579,32 @@
                 <w:szCs w:val="18"/>
               </w:rPr>
             </w:pPr>
+            <w:r>
+              <w:rPr>
+                <w:rFonts w:ascii="Arial" w:hAnsi="Arial" w:cs="Arial"/>
+                <w:sz w:val="18"/>
+                <w:szCs w:val="18"/>
+              </w:rPr>
+              <w:t>{</w:t>
+            </w:r>
+            <w:proofErr w:type="spellStart"/>
+            <w:r>
+              <w:rPr>
+                <w:rFonts w:ascii="Arial" w:hAnsi="Arial" w:cs="Arial"/>
+                <w:sz w:val="18"/>
+                <w:szCs w:val="18"/>
+              </w:rPr>
+              <w:t>CoBorrowerName</w:t>
+            </w:r>
+            <w:proofErr w:type="spellEnd"/>
+            <w:r>
+              <w:rPr>
+                <w:rFonts w:ascii="Arial" w:hAnsi="Arial" w:cs="Arial"/>
+                <w:sz w:val="18"/>
+                <w:szCs w:val="18"/>
+              </w:rPr>
+              <w:t>}</w:t>
+            </w:r>
           </w:p>
         </w:tc>
         <w:tc>
@@ -571,6 +675,32 @@
                 <w:szCs w:val="18"/>
               </w:rPr>
             </w:pPr>
+            <w:r>
+              <w:rPr>
+                <w:rFonts w:ascii="Arial" w:hAnsi="Arial" w:cs="Arial"/>
+                <w:sz w:val="18"/>
+                <w:szCs w:val="18"/>
+              </w:rPr>
+              <w:t>{</w:t>
+            </w:r>
+            <w:proofErr w:type="spellStart"/>
+            <w:r>
+              <w:rPr>
+                <w:rFonts w:ascii="Arial" w:hAnsi="Arial" w:cs="Arial"/>
+                <w:sz w:val="18"/>
+                <w:szCs w:val="18"/>
+              </w:rPr>
+              <w:t>CoBorrowerAddress</w:t>
+            </w:r>
+            <w:proofErr w:type="spellEnd"/>
+            <w:r>
+              <w:rPr>
+                <w:rFonts w:ascii="Arial" w:hAnsi="Arial" w:cs="Arial"/>
+                <w:sz w:val="18"/>
+                <w:szCs w:val="18"/>
+              </w:rPr>
+              <w:t>}</w:t>
+            </w:r>
           </w:p>
         </w:tc>
         <w:tc>
@@ -744,6 +874,32 @@
                 <w:szCs w:val="18"/>
               </w:rPr>
             </w:pPr>
+            <w:r>
+              <w:rPr>
+                <w:rFonts w:ascii="Arial" w:hAnsi="Arial" w:cs="Arial"/>
+                <w:sz w:val="18"/>
+                <w:szCs w:val="18"/>
+              </w:rPr>
+              <w:t>{</w:t>
+            </w:r>
+            <w:proofErr w:type="spellStart"/>
+            <w:r>
+              <w:rPr>
+                <w:rFonts w:ascii="Arial" w:hAnsi="Arial" w:cs="Arial"/>
+                <w:sz w:val="18"/>
+                <w:szCs w:val="18"/>
+              </w:rPr>
+              <w:t>SOANumber</w:t>
+            </w:r>
+            <w:proofErr w:type="spellEnd"/>
+            <w:r>
+              <w:rPr>
+                <w:rFonts w:ascii="Arial" w:hAnsi="Arial" w:cs="Arial"/>
+                <w:sz w:val="18"/>
+                <w:szCs w:val="18"/>
+              </w:rPr>
+              <w:t>}</w:t>
+            </w:r>
           </w:p>
         </w:tc>
         <w:tc>
@@ -796,6 +952,32 @@
                 <w:szCs w:val="18"/>
               </w:rPr>
             </w:pPr>
+            <w:r>
+              <w:rPr>
+                <w:rFonts w:ascii="Arial" w:hAnsi="Arial" w:cs="Arial"/>
+                <w:sz w:val="18"/>
+                <w:szCs w:val="18"/>
+              </w:rPr>
+              <w:t>{</w:t>
+            </w:r>
+            <w:proofErr w:type="spellStart"/>
+            <w:r>
+              <w:rPr>
+                <w:rFonts w:ascii="Arial" w:hAnsi="Arial" w:cs="Arial"/>
+                <w:sz w:val="18"/>
+                <w:szCs w:val="18"/>
+              </w:rPr>
+              <w:t>PNNumber</w:t>
+            </w:r>
+            <w:proofErr w:type="spellEnd"/>
+            <w:r>
+              <w:rPr>
+                <w:rFonts w:ascii="Arial" w:hAnsi="Arial" w:cs="Arial"/>
+                <w:sz w:val="18"/>
+                <w:szCs w:val="18"/>
+              </w:rPr>
+              <w:t>}</w:t>
+            </w:r>
           </w:p>
         </w:tc>
         <w:tc>
@@ -848,6 +1030,32 @@
                 <w:szCs w:val="18"/>
               </w:rPr>
             </w:pPr>
+            <w:r>
+              <w:rPr>
+                <w:rFonts w:ascii="Arial" w:hAnsi="Arial" w:cs="Arial"/>
+                <w:sz w:val="18"/>
+                <w:szCs w:val="18"/>
+              </w:rPr>
+              <w:t>{</w:t>
+            </w:r>
+            <w:proofErr w:type="spellStart"/>
+            <w:r>
+              <w:rPr>
+                <w:rFonts w:ascii="Arial" w:hAnsi="Arial" w:cs="Arial"/>
+                <w:sz w:val="18"/>
+                <w:szCs w:val="18"/>
+              </w:rPr>
+              <w:t>LoanDate</w:t>
+            </w:r>
+            <w:proofErr w:type="spellEnd"/>
+            <w:r>
+              <w:rPr>
+                <w:rFonts w:ascii="Arial" w:hAnsi="Arial" w:cs="Arial"/>
+                <w:sz w:val="18"/>
+                <w:szCs w:val="18"/>
+              </w:rPr>
+              <w:t>}</w:t>
+            </w:r>
           </w:p>
         </w:tc>
         <w:tc>
@@ -908,6 +1116,14 @@
                 <w:szCs w:val="18"/>
               </w:rPr>
             </w:pPr>
+            <w:r>
+              <w:rPr>
+                <w:rFonts w:ascii="Arial" w:hAnsi="Arial" w:cs="Arial"/>
+                <w:sz w:val="18"/>
+                <w:szCs w:val="18"/>
+              </w:rPr>
+              <w:t>{Term}</w:t>
+            </w:r>
           </w:p>
         </w:tc>
         <w:tc>
@@ -960,6 +1176,32 @@
                 <w:szCs w:val="18"/>
               </w:rPr>
             </w:pPr>
+            <w:r>
+              <w:rPr>
+                <w:rFonts w:ascii="Arial" w:hAnsi="Arial" w:cs="Arial"/>
+                <w:sz w:val="18"/>
+                <w:szCs w:val="18"/>
+              </w:rPr>
+              <w:t>{</w:t>
+            </w:r>
+            <w:proofErr w:type="spellStart"/>
+            <w:r>
+              <w:rPr>
+                <w:rFonts w:ascii="Arial" w:hAnsi="Arial" w:cs="Arial"/>
+                <w:sz w:val="18"/>
+                <w:szCs w:val="18"/>
+              </w:rPr>
+              <w:t>MaturityDate</w:t>
+            </w:r>
+            <w:proofErr w:type="spellEnd"/>
+            <w:r>
+              <w:rPr>
+                <w:rFonts w:ascii="Arial" w:hAnsi="Arial" w:cs="Arial"/>
+                <w:sz w:val="18"/>
+                <w:szCs w:val="18"/>
+              </w:rPr>
+              <w:t>}</w:t>
+            </w:r>
           </w:p>
         </w:tc>
         <w:tc>
@@ -1018,6 +1260,32 @@
                 <w:szCs w:val="18"/>
               </w:rPr>
             </w:pPr>
+            <w:r>
+              <w:rPr>
+                <w:rFonts w:ascii="Arial" w:hAnsi="Arial" w:cs="Arial"/>
+                <w:sz w:val="18"/>
+                <w:szCs w:val="18"/>
+              </w:rPr>
+              <w:t>{</w:t>
+            </w:r>
+            <w:proofErr w:type="spellStart"/>
+            <w:r>
+              <w:rPr>
+                <w:rFonts w:ascii="Arial" w:hAnsi="Arial" w:cs="Arial"/>
+                <w:sz w:val="18"/>
+                <w:szCs w:val="18"/>
+              </w:rPr>
+              <w:t>PNValue</w:t>
+            </w:r>
+            <w:proofErr w:type="spellEnd"/>
+            <w:r>
+              <w:rPr>
+                <w:rFonts w:ascii="Arial" w:hAnsi="Arial" w:cs="Arial"/>
+                <w:sz w:val="18"/>
+                <w:szCs w:val="18"/>
+              </w:rPr>
+              <w:t>}</w:t>
+            </w:r>
           </w:p>
         </w:tc>
         <w:tc>
@@ -1104,25 +1372,27 @@
     <w:tbl>
       <w:tblPr>
         <w:tblStyle w:val="TableGrid"/>
-        <w:tblW w:w="0" w:type="auto"/>
+        <w:tblW w:w="10805" w:type="dxa"/>
+        <w:tblBorders>
+          <w:top w:val="none" w:sz="0" w:space="0" w:color="auto"/>
+          <w:left w:val="none" w:sz="0" w:space="0" w:color="auto"/>
+          <w:bottom w:val="none" w:sz="0" w:space="0" w:color="auto"/>
+          <w:right w:val="none" w:sz="0" w:space="0" w:color="auto"/>
+          <w:insideH w:val="none" w:sz="0" w:space="0" w:color="auto"/>
+          <w:insideV w:val="none" w:sz="0" w:space="0" w:color="auto"/>
+        </w:tblBorders>
         <w:tblLook w:val="04A0" w:firstRow="1" w:lastRow="0" w:firstColumn="1" w:lastColumn="0" w:noHBand="0" w:noVBand="1"/>
       </w:tblPr>
       <w:tblGrid>
-        <w:gridCol w:w="3505"/>
-        <w:gridCol w:w="3493"/>
-        <w:gridCol w:w="3468"/>
+        <w:gridCol w:w="3544"/>
+        <w:gridCol w:w="3450"/>
+        <w:gridCol w:w="3811"/>
       </w:tblGrid>
       <w:tr>
         <w:tc>
           <w:tcPr>
-            <w:tcW w:w="10466" w:type="dxa"/>
+            <w:tcW w:w="10805" w:type="dxa"/>
             <w:gridSpan w:val="3"/>
-            <w:tcBorders>
-              <w:top w:val="nil"/>
-              <w:left w:val="nil"/>
-              <w:bottom w:val="single" w:sz="18" w:space="0" w:color="auto"/>
-              <w:right w:val="nil"/>
-            </w:tcBorders>
           </w:tcPr>
           <w:p>
             <w:pPr>
@@ -1148,13 +1418,7 @@
       <w:tr>
         <w:tc>
           <w:tcPr>
-            <w:tcW w:w="3505" w:type="dxa"/>
-            <w:tcBorders>
-              <w:top w:val="single" w:sz="18" w:space="0" w:color="auto"/>
-              <w:left w:val="nil"/>
-              <w:bottom w:val="nil"/>
-              <w:right w:val="nil"/>
-            </w:tcBorders>
+            <w:tcW w:w="3544" w:type="dxa"/>
           </w:tcPr>
           <w:p>
             <w:pPr>
@@ -1168,13 +1432,7 @@
         </w:tc>
         <w:tc>
           <w:tcPr>
-            <w:tcW w:w="3493" w:type="dxa"/>
-            <w:tcBorders>
-              <w:top w:val="single" w:sz="18" w:space="0" w:color="auto"/>
-              <w:left w:val="nil"/>
-              <w:bottom w:val="nil"/>
-              <w:right w:val="nil"/>
-            </w:tcBorders>
+            <w:tcW w:w="3450" w:type="dxa"/>
           </w:tcPr>
           <w:p>
             <w:pPr>
@@ -1188,13 +1446,7 @@
         </w:tc>
         <w:tc>
           <w:tcPr>
-            <w:tcW w:w="3468" w:type="dxa"/>
-            <w:tcBorders>
-              <w:top w:val="single" w:sz="18" w:space="0" w:color="auto"/>
-              <w:left w:val="nil"/>
-              <w:bottom w:val="nil"/>
-              <w:right w:val="nil"/>
-            </w:tcBorders>
+            <w:tcW w:w="3811" w:type="dxa"/>
           </w:tcPr>
           <w:p>
             <w:pPr>
@@ -1210,12 +1462,9 @@
       <w:tr>
         <w:tc>
           <w:tcPr>
-            <w:tcW w:w="3505" w:type="dxa"/>
+            <w:tcW w:w="3544" w:type="dxa"/>
             <w:tcBorders>
-              <w:top w:val="nil"/>
-              <w:left w:val="nil"/>
               <w:bottom w:val="single" w:sz="4" w:space="0" w:color="auto"/>
-              <w:right w:val="nil"/>
             </w:tcBorders>
           </w:tcPr>
           <w:p>
@@ -1238,12 +1487,9 @@
         </w:tc>
         <w:tc>
           <w:tcPr>
-            <w:tcW w:w="3493" w:type="dxa"/>
+            <w:tcW w:w="3450" w:type="dxa"/>
             <w:tcBorders>
-              <w:top w:val="nil"/>
-              <w:left w:val="nil"/>
               <w:bottom w:val="single" w:sz="4" w:space="0" w:color="auto"/>
-              <w:right w:val="nil"/>
             </w:tcBorders>
           </w:tcPr>
           <w:p>
@@ -1258,12 +1504,9 @@
         </w:tc>
         <w:tc>
           <w:tcPr>
-            <w:tcW w:w="3468" w:type="dxa"/>
+            <w:tcW w:w="3811" w:type="dxa"/>
             <w:tcBorders>
-              <w:top w:val="nil"/>
-              <w:left w:val="nil"/>
               <w:bottom w:val="single" w:sz="4" w:space="0" w:color="auto"/>
-              <w:right w:val="nil"/>
             </w:tcBorders>
           </w:tcPr>
           <w:p>
@@ -1276,18 +1519,41 @@
                 <w:szCs w:val="18"/>
               </w:rPr>
             </w:pPr>
+            <w:r>
+              <w:rPr>
+                <w:rFonts w:ascii="Arial" w:hAnsi="Arial" w:cs="Arial"/>
+                <w:sz w:val="18"/>
+                <w:szCs w:val="18"/>
+              </w:rPr>
+              <w:t>{</w:t>
+            </w:r>
+            <w:proofErr w:type="spellStart"/>
+            <w:r>
+              <w:rPr>
+                <w:rFonts w:ascii="Arial" w:hAnsi="Arial" w:cs="Arial"/>
+                <w:sz w:val="18"/>
+                <w:szCs w:val="18"/>
+              </w:rPr>
+              <w:t>CurrentAmortizationDue</w:t>
+            </w:r>
+            <w:proofErr w:type="spellEnd"/>
+            <w:r>
+              <w:rPr>
+                <w:rFonts w:ascii="Arial" w:hAnsi="Arial" w:cs="Arial"/>
+                <w:sz w:val="18"/>
+                <w:szCs w:val="18"/>
+              </w:rPr>
+              <w:t>}</w:t>
+            </w:r>
           </w:p>
         </w:tc>
       </w:tr>
       <w:tr>
         <w:tc>
           <w:tcPr>
-            <w:tcW w:w="3505" w:type="dxa"/>
+            <w:tcW w:w="3544" w:type="dxa"/>
             <w:tcBorders>
               <w:top w:val="single" w:sz="4" w:space="0" w:color="auto"/>
-              <w:left w:val="nil"/>
-              <w:bottom w:val="single" w:sz="4" w:space="0" w:color="auto"/>
-              <w:right w:val="nil"/>
             </w:tcBorders>
           </w:tcPr>
           <w:p>
@@ -1353,12 +1619,9 @@
         </w:tc>
         <w:tc>
           <w:tcPr>
-            <w:tcW w:w="3493" w:type="dxa"/>
+            <w:tcW w:w="3450" w:type="dxa"/>
             <w:tcBorders>
               <w:top w:val="single" w:sz="4" w:space="0" w:color="auto"/>
-              <w:left w:val="nil"/>
-              <w:bottom w:val="single" w:sz="4" w:space="0" w:color="auto"/>
-              <w:right w:val="nil"/>
             </w:tcBorders>
           </w:tcPr>
           <w:p>
@@ -1400,16 +1663,39 @@
                 <w:szCs w:val="18"/>
               </w:rPr>
             </w:pPr>
-          </w:p>
-        </w:tc>
-        <w:tc>
-          <w:tcPr>
-            <w:tcW w:w="3468" w:type="dxa"/>
+            <w:r>
+              <w:rPr>
+                <w:rFonts w:ascii="Arial" w:hAnsi="Arial" w:cs="Arial"/>
+                <w:sz w:val="18"/>
+                <w:szCs w:val="18"/>
+              </w:rPr>
+              <w:t>{</w:t>
+            </w:r>
+            <w:proofErr w:type="spellStart"/>
+            <w:r>
+              <w:rPr>
+                <w:rFonts w:ascii="Arial" w:hAnsi="Arial" w:cs="Arial"/>
+                <w:sz w:val="18"/>
+                <w:szCs w:val="18"/>
+              </w:rPr>
+              <w:t>PastDuePrincipal</w:t>
+            </w:r>
+            <w:proofErr w:type="spellEnd"/>
+            <w:r>
+              <w:rPr>
+                <w:rFonts w:ascii="Arial" w:hAnsi="Arial" w:cs="Arial"/>
+                <w:sz w:val="18"/>
+                <w:szCs w:val="18"/>
+              </w:rPr>
+              <w:t>}</w:t>
+            </w:r>
+          </w:p>
+        </w:tc>
+        <w:tc>
+          <w:tcPr>
+            <w:tcW w:w="3811" w:type="dxa"/>
             <w:tcBorders>
               <w:top w:val="single" w:sz="4" w:space="0" w:color="auto"/>
-              <w:left w:val="nil"/>
-              <w:bottom w:val="single" w:sz="4" w:space="0" w:color="auto"/>
-              <w:right w:val="nil"/>
             </w:tcBorders>
           </w:tcPr>
           <w:p>
@@ -1426,12 +1712,687 @@
       <w:tr>
         <w:tc>
           <w:tcPr>
-            <w:tcW w:w="3505" w:type="dxa"/>
+            <w:tcW w:w="3544" w:type="dxa"/>
+          </w:tcPr>
+          <w:p>
+            <w:pPr>
+              <w:rPr>
+                <w:rFonts w:ascii="Arial" w:hAnsi="Arial" w:cs="Arial"/>
+                <w:sz w:val="18"/>
+                <w:szCs w:val="18"/>
+              </w:rPr>
+            </w:pPr>
+            <w:r>
+              <w:rPr>
+                <w:rFonts w:ascii="Arial" w:hAnsi="Arial" w:cs="Arial"/>
+                <w:sz w:val="18"/>
+                <w:szCs w:val="18"/>
+              </w:rPr>
+              <w:t xml:space="preserve">Interest </w:t>
+            </w:r>
+          </w:p>
+        </w:tc>
+        <w:tc>
+          <w:tcPr>
+            <w:tcW w:w="3450" w:type="dxa"/>
+          </w:tcPr>
+          <w:p>
+            <w:pPr>
+              <w:ind w:left="1633"/>
+              <w:jc w:val="right"/>
+              <w:rPr>
+                <w:rFonts w:ascii="Arial" w:hAnsi="Arial" w:cs="Arial"/>
+                <w:sz w:val="18"/>
+                <w:szCs w:val="18"/>
+              </w:rPr>
+            </w:pPr>
+            <w:r>
+              <w:rPr>
+                <w:rFonts w:ascii="Arial" w:hAnsi="Arial" w:cs="Arial"/>
+                <w:sz w:val="18"/>
+                <w:szCs w:val="18"/>
+              </w:rPr>
+              <w:t>{</w:t>
+            </w:r>
+            <w:proofErr w:type="spellStart"/>
+            <w:r>
+              <w:rPr>
+                <w:rFonts w:ascii="Arial" w:hAnsi="Arial" w:cs="Arial"/>
+                <w:sz w:val="18"/>
+                <w:szCs w:val="18"/>
+              </w:rPr>
+              <w:t>PastDueInterest</w:t>
+            </w:r>
+            <w:proofErr w:type="spellEnd"/>
+            <w:r>
+              <w:rPr>
+                <w:rFonts w:ascii="Arial" w:hAnsi="Arial" w:cs="Arial"/>
+                <w:sz w:val="18"/>
+                <w:szCs w:val="18"/>
+              </w:rPr>
+              <w:t>}</w:t>
+            </w:r>
+          </w:p>
+        </w:tc>
+        <w:tc>
+          <w:tcPr>
+            <w:tcW w:w="3811" w:type="dxa"/>
+          </w:tcPr>
+          <w:p>
+            <w:pPr>
+              <w:rPr>
+                <w:rFonts w:ascii="Arial" w:hAnsi="Arial" w:cs="Arial"/>
+                <w:sz w:val="18"/>
+                <w:szCs w:val="18"/>
+              </w:rPr>
+            </w:pPr>
+          </w:p>
+        </w:tc>
+      </w:tr>
+      <w:tr>
+        <w:tc>
+          <w:tcPr>
+            <w:tcW w:w="3544" w:type="dxa"/>
+          </w:tcPr>
+          <w:p>
+            <w:pPr>
+              <w:rPr>
+                <w:rFonts w:ascii="Arial" w:hAnsi="Arial" w:cs="Arial"/>
+                <w:sz w:val="14"/>
+                <w:szCs w:val="14"/>
+              </w:rPr>
+            </w:pPr>
+            <w:r>
+              <w:rPr>
+                <w:rFonts w:ascii="Arial" w:hAnsi="Arial" w:cs="Arial"/>
+                <w:sz w:val="18"/>
+                <w:szCs w:val="18"/>
+              </w:rPr>
+              <w:t>Penalty</w:t>
+            </w:r>
+            <w:r>
+              <w:rPr>
+                <w:rFonts w:ascii="Arial" w:hAnsi="Arial" w:cs="Arial"/>
+                <w:sz w:val="14"/>
+                <w:szCs w:val="14"/>
+              </w:rPr>
+              <w:t xml:space="preserve"> </w:t>
+            </w:r>
+            <w:r>
+              <w:rPr>
+                <w:rFonts w:ascii="Arial" w:hAnsi="Arial" w:cs="Arial"/>
+                <w:sz w:val="14"/>
+                <w:szCs w:val="14"/>
+              </w:rPr>
+              <w:t>{</w:t>
+            </w:r>
+            <w:proofErr w:type="spellStart"/>
+            <w:r>
+              <w:rPr>
+                <w:rFonts w:ascii="Arial" w:hAnsi="Arial" w:cs="Arial"/>
+                <w:sz w:val="14"/>
+                <w:szCs w:val="14"/>
+              </w:rPr>
+              <w:t>PenaltyFromDate</w:t>
+            </w:r>
+            <w:proofErr w:type="spellEnd"/>
+            <w:r>
+              <w:rPr>
+                <w:rFonts w:ascii="Arial" w:hAnsi="Arial" w:cs="Arial"/>
+                <w:sz w:val="14"/>
+                <w:szCs w:val="14"/>
+              </w:rPr>
+              <w:t>} / {</w:t>
+            </w:r>
+            <w:proofErr w:type="spellStart"/>
+            <w:r>
+              <w:rPr>
+                <w:rFonts w:ascii="Arial" w:hAnsi="Arial" w:cs="Arial"/>
+                <w:sz w:val="14"/>
+                <w:szCs w:val="14"/>
+              </w:rPr>
+              <w:t>PenaltyToDate</w:t>
+            </w:r>
+            <w:proofErr w:type="spellEnd"/>
+            <w:r>
+              <w:rPr>
+                <w:rFonts w:ascii="Arial" w:hAnsi="Arial" w:cs="Arial"/>
+                <w:sz w:val="14"/>
+                <w:szCs w:val="14"/>
+              </w:rPr>
+              <w:t>}</w:t>
+            </w:r>
+          </w:p>
+        </w:tc>
+        <w:tc>
+          <w:tcPr>
+            <w:tcW w:w="3450" w:type="dxa"/>
+          </w:tcPr>
+          <w:p>
+            <w:pPr>
+              <w:jc w:val="right"/>
+              <w:rPr>
+                <w:rFonts w:ascii="Arial" w:hAnsi="Arial" w:cs="Arial"/>
+                <w:sz w:val="18"/>
+                <w:szCs w:val="18"/>
+              </w:rPr>
+            </w:pPr>
+            <w:r>
+              <w:rPr>
+                <w:rFonts w:ascii="Arial" w:hAnsi="Arial" w:cs="Arial"/>
+                <w:sz w:val="18"/>
+                <w:szCs w:val="18"/>
+              </w:rPr>
+              <w:t>{</w:t>
+            </w:r>
+            <w:proofErr w:type="spellStart"/>
+            <w:r>
+              <w:rPr>
+                <w:rFonts w:ascii="Arial" w:hAnsi="Arial" w:cs="Arial"/>
+                <w:sz w:val="18"/>
+                <w:szCs w:val="18"/>
+              </w:rPr>
+              <w:t>PastDuePenalty</w:t>
+            </w:r>
+            <w:proofErr w:type="spellEnd"/>
+            <w:r>
+              <w:rPr>
+                <w:rFonts w:ascii="Arial" w:hAnsi="Arial" w:cs="Arial"/>
+                <w:sz w:val="18"/>
+                <w:szCs w:val="18"/>
+              </w:rPr>
+              <w:t>}</w:t>
+            </w:r>
+          </w:p>
+        </w:tc>
+        <w:tc>
+          <w:tcPr>
+            <w:tcW w:w="3811" w:type="dxa"/>
+          </w:tcPr>
+          <w:p>
+            <w:pPr>
+              <w:rPr>
+                <w:rFonts w:ascii="Arial" w:hAnsi="Arial" w:cs="Arial"/>
+                <w:sz w:val="18"/>
+                <w:szCs w:val="18"/>
+              </w:rPr>
+            </w:pPr>
+          </w:p>
+        </w:tc>
+      </w:tr>
+      <w:tr>
+        <w:tc>
+          <w:tcPr>
+            <w:tcW w:w="3544" w:type="dxa"/>
+          </w:tcPr>
+          <w:p>
+            <w:pPr>
+              <w:rPr>
+                <w:rFonts w:ascii="Arial" w:hAnsi="Arial" w:cs="Arial"/>
+                <w:b/>
+                <w:bCs/>
+                <w:sz w:val="18"/>
+                <w:szCs w:val="18"/>
+              </w:rPr>
+            </w:pPr>
+            <w:r>
+              <w:rPr>
+                <w:rFonts w:ascii="Arial" w:hAnsi="Arial" w:cs="Arial"/>
+                <w:b/>
+                <w:bCs/>
+                <w:sz w:val="18"/>
+                <w:szCs w:val="18"/>
+              </w:rPr>
+              <w:t>Total Past Due</w:t>
+            </w:r>
+          </w:p>
+        </w:tc>
+        <w:tc>
+          <w:tcPr>
+            <w:tcW w:w="3450" w:type="dxa"/>
+          </w:tcPr>
+          <w:p>
+            <w:pPr>
+              <w:jc w:val="right"/>
+              <w:rPr>
+                <w:rFonts w:ascii="Arial" w:hAnsi="Arial" w:cs="Arial"/>
+                <w:sz w:val="18"/>
+                <w:szCs w:val="18"/>
+              </w:rPr>
+            </w:pPr>
+          </w:p>
+        </w:tc>
+        <w:tc>
+          <w:tcPr>
+            <w:tcW w:w="3811" w:type="dxa"/>
+          </w:tcPr>
+          <w:p>
+            <w:pPr>
+              <w:jc w:val="right"/>
+              <w:rPr>
+                <w:rFonts w:ascii="Arial" w:hAnsi="Arial" w:cs="Arial"/>
+                <w:sz w:val="18"/>
+                <w:szCs w:val="18"/>
+              </w:rPr>
+            </w:pPr>
+            <w:r>
+              <w:rPr>
+                <w:rFonts w:ascii="Arial" w:hAnsi="Arial" w:cs="Arial"/>
+                <w:sz w:val="18"/>
+                <w:szCs w:val="18"/>
+              </w:rPr>
+              <w:t>{</w:t>
+            </w:r>
+            <w:proofErr w:type="spellStart"/>
+            <w:r>
+              <w:rPr>
+                <w:rFonts w:ascii="Arial" w:hAnsi="Arial" w:cs="Arial"/>
+                <w:sz w:val="18"/>
+                <w:szCs w:val="18"/>
+              </w:rPr>
+              <w:t>TotalPastDue</w:t>
+            </w:r>
+            <w:proofErr w:type="spellEnd"/>
+            <w:r>
+              <w:rPr>
+                <w:rFonts w:ascii="Arial" w:hAnsi="Arial" w:cs="Arial"/>
+                <w:sz w:val="18"/>
+                <w:szCs w:val="18"/>
+              </w:rPr>
+              <w:t>}</w:t>
+            </w:r>
+          </w:p>
+        </w:tc>
+      </w:tr>
+      <w:tr>
+        <w:tc>
+          <w:tcPr>
+            <w:tcW w:w="3544" w:type="dxa"/>
+          </w:tcPr>
+          <w:p>
+            <w:pPr>
+              <w:rPr>
+                <w:rFonts w:ascii="Arial" w:hAnsi="Arial" w:cs="Arial"/>
+                <w:sz w:val="18"/>
+                <w:szCs w:val="18"/>
+              </w:rPr>
+            </w:pPr>
+          </w:p>
+          <w:p>
+            <w:pPr>
+              <w:rPr>
+                <w:rFonts w:ascii="Arial" w:hAnsi="Arial" w:cs="Arial"/>
+                <w:b/>
+                <w:bCs/>
+                <w:sz w:val="18"/>
+                <w:szCs w:val="18"/>
+              </w:rPr>
+            </w:pPr>
+            <w:r>
+              <w:rPr>
+                <w:rFonts w:ascii="Arial" w:hAnsi="Arial" w:cs="Arial"/>
+                <w:b/>
+                <w:bCs/>
+                <w:sz w:val="18"/>
+                <w:szCs w:val="18"/>
+              </w:rPr>
+              <w:t>Additional Charges</w:t>
+            </w:r>
+          </w:p>
+        </w:tc>
+        <w:tc>
+          <w:tcPr>
+            <w:tcW w:w="3450" w:type="dxa"/>
+          </w:tcPr>
+          <w:p>
+            <w:pPr>
+              <w:jc w:val="right"/>
+              <w:rPr>
+                <w:rFonts w:ascii="Arial" w:hAnsi="Arial" w:cs="Arial"/>
+                <w:sz w:val="18"/>
+                <w:szCs w:val="18"/>
+              </w:rPr>
+            </w:pPr>
+          </w:p>
+        </w:tc>
+        <w:tc>
+          <w:tcPr>
+            <w:tcW w:w="3811" w:type="dxa"/>
+          </w:tcPr>
+          <w:p>
+            <w:pPr>
+              <w:rPr>
+                <w:rFonts w:ascii="Arial" w:hAnsi="Arial" w:cs="Arial"/>
+                <w:sz w:val="18"/>
+                <w:szCs w:val="18"/>
+              </w:rPr>
+            </w:pPr>
+          </w:p>
+        </w:tc>
+      </w:tr>
+      <w:tr>
+        <w:tc>
+          <w:tcPr>
+            <w:tcW w:w="3544" w:type="dxa"/>
+          </w:tcPr>
+          <w:p>
+            <w:pPr>
+              <w:rPr>
+                <w:rFonts w:ascii="Arial" w:hAnsi="Arial" w:cs="Arial"/>
+                <w:sz w:val="18"/>
+                <w:szCs w:val="18"/>
+              </w:rPr>
+            </w:pPr>
+            <w:r>
+              <w:rPr>
+                <w:rFonts w:ascii="Arial" w:hAnsi="Arial" w:cs="Arial"/>
+                <w:sz w:val="18"/>
+                <w:szCs w:val="18"/>
+              </w:rPr>
+              <w:t>Accrued Interest</w:t>
+            </w:r>
+            <w:r>
+              <w:rPr>
+                <w:rFonts w:ascii="Arial" w:hAnsi="Arial" w:cs="Arial"/>
+                <w:sz w:val="18"/>
+                <w:szCs w:val="18"/>
+              </w:rPr>
+              <w:t xml:space="preserve"> </w:t>
+            </w:r>
+            <w:r>
+              <w:rPr>
+                <w:rFonts w:ascii="Arial" w:hAnsi="Arial" w:cs="Arial"/>
+                <w:sz w:val="14"/>
+                <w:szCs w:val="14"/>
+              </w:rPr>
+              <w:t>{</w:t>
+            </w:r>
+            <w:proofErr w:type="spellStart"/>
+            <w:proofErr w:type="gramStart"/>
+            <w:r>
+              <w:rPr>
+                <w:rFonts w:ascii="Arial" w:hAnsi="Arial" w:cs="Arial"/>
+                <w:sz w:val="14"/>
+                <w:szCs w:val="14"/>
+              </w:rPr>
+              <w:t>AccruedInterestAsOfDate</w:t>
+            </w:r>
+            <w:proofErr w:type="spellEnd"/>
+            <w:r>
+              <w:rPr>
+                <w:rFonts w:ascii="Arial" w:hAnsi="Arial" w:cs="Arial"/>
+                <w:sz w:val="14"/>
+                <w:szCs w:val="14"/>
+              </w:rPr>
+              <w:t>}</w:t>
+            </w:r>
+            <w:r>
+              <w:rPr>
+                <w:rFonts w:ascii="Arial" w:hAnsi="Arial" w:cs="Arial"/>
+                <w:sz w:val="10"/>
+                <w:szCs w:val="10"/>
+              </w:rPr>
+              <w:t xml:space="preserve"> </w:t>
+            </w:r>
+            <w:r>
+              <w:rPr>
+                <w:rFonts w:ascii="Arial" w:hAnsi="Arial" w:cs="Arial"/>
+                <w:sz w:val="14"/>
+                <w:szCs w:val="14"/>
+              </w:rPr>
+              <w:t xml:space="preserve">  </w:t>
+            </w:r>
+            <w:proofErr w:type="gramEnd"/>
+            <w:r>
+              <w:rPr>
+                <w:rFonts w:ascii="Arial" w:hAnsi="Arial" w:cs="Arial"/>
+                <w:sz w:val="14"/>
+                <w:szCs w:val="14"/>
+              </w:rPr>
+              <w:t xml:space="preserve"> </w:t>
+            </w:r>
+          </w:p>
+        </w:tc>
+        <w:tc>
+          <w:tcPr>
+            <w:tcW w:w="3450" w:type="dxa"/>
+          </w:tcPr>
+          <w:p>
+            <w:pPr>
+              <w:jc w:val="right"/>
+              <w:rPr>
+                <w:rFonts w:ascii="Arial" w:hAnsi="Arial" w:cs="Arial"/>
+                <w:sz w:val="18"/>
+                <w:szCs w:val="18"/>
+              </w:rPr>
+            </w:pPr>
+          </w:p>
+        </w:tc>
+        <w:tc>
+          <w:tcPr>
+            <w:tcW w:w="3811" w:type="dxa"/>
+          </w:tcPr>
+          <w:p>
+            <w:pPr>
+              <w:jc w:val="right"/>
+              <w:rPr>
+                <w:rFonts w:ascii="Arial" w:hAnsi="Arial" w:cs="Arial"/>
+                <w:sz w:val="18"/>
+                <w:szCs w:val="18"/>
+              </w:rPr>
+            </w:pPr>
+            <w:r>
+              <w:rPr>
+                <w:rFonts w:ascii="Arial" w:hAnsi="Arial" w:cs="Arial"/>
+                <w:sz w:val="18"/>
+                <w:szCs w:val="18"/>
+              </w:rPr>
+              <w:t>{</w:t>
+            </w:r>
+            <w:proofErr w:type="spellStart"/>
+            <w:r>
+              <w:rPr>
+                <w:rFonts w:ascii="Arial" w:hAnsi="Arial" w:cs="Arial"/>
+                <w:sz w:val="18"/>
+                <w:szCs w:val="18"/>
+              </w:rPr>
+              <w:t>AccruedInterest</w:t>
+            </w:r>
+            <w:proofErr w:type="spellEnd"/>
+            <w:r>
+              <w:rPr>
+                <w:rFonts w:ascii="Arial" w:hAnsi="Arial" w:cs="Arial"/>
+                <w:sz w:val="18"/>
+                <w:szCs w:val="18"/>
+              </w:rPr>
+              <w:t>}</w:t>
+            </w:r>
+          </w:p>
+        </w:tc>
+      </w:tr>
+      <w:tr>
+        <w:tc>
+          <w:tcPr>
+            <w:tcW w:w="3544" w:type="dxa"/>
+          </w:tcPr>
+          <w:p>
+            <w:pPr>
+              <w:rPr>
+                <w:rFonts w:ascii="Arial" w:hAnsi="Arial" w:cs="Arial"/>
+                <w:sz w:val="18"/>
+                <w:szCs w:val="18"/>
+              </w:rPr>
+            </w:pPr>
+            <w:r>
+              <w:rPr>
+                <w:rFonts w:ascii="Arial" w:hAnsi="Arial" w:cs="Arial"/>
+                <w:sz w:val="18"/>
+                <w:szCs w:val="18"/>
+              </w:rPr>
+              <w:t xml:space="preserve">Other </w:t>
+            </w:r>
+            <w:r>
+              <w:rPr>
+                <w:rFonts w:ascii="Arial" w:hAnsi="Arial" w:cs="Arial"/>
+                <w:sz w:val="18"/>
+                <w:szCs w:val="18"/>
+              </w:rPr>
+              <w:t>Fees</w:t>
+            </w:r>
+          </w:p>
+        </w:tc>
+        <w:tc>
+          <w:tcPr>
+            <w:tcW w:w="3450" w:type="dxa"/>
+          </w:tcPr>
+          <w:p>
+            <w:pPr>
+              <w:jc w:val="right"/>
+              <w:rPr>
+                <w:rFonts w:ascii="Arial" w:hAnsi="Arial" w:cs="Arial"/>
+                <w:sz w:val="18"/>
+                <w:szCs w:val="18"/>
+              </w:rPr>
+            </w:pPr>
+          </w:p>
+        </w:tc>
+        <w:tc>
+          <w:tcPr>
+            <w:tcW w:w="3811" w:type="dxa"/>
+          </w:tcPr>
+          <w:p>
+            <w:pPr>
+              <w:jc w:val="right"/>
+              <w:rPr>
+                <w:rFonts w:ascii="Arial" w:hAnsi="Arial" w:cs="Arial"/>
+                <w:sz w:val="18"/>
+                <w:szCs w:val="18"/>
+              </w:rPr>
+            </w:pPr>
+            <w:r>
+              <w:rPr>
+                <w:rFonts w:ascii="Arial" w:hAnsi="Arial" w:cs="Arial"/>
+                <w:sz w:val="18"/>
+                <w:szCs w:val="18"/>
+              </w:rPr>
+              <w:t>{</w:t>
+            </w:r>
+            <w:proofErr w:type="spellStart"/>
+            <w:r>
+              <w:rPr>
+                <w:rFonts w:ascii="Arial" w:hAnsi="Arial" w:cs="Arial"/>
+                <w:sz w:val="18"/>
+                <w:szCs w:val="18"/>
+              </w:rPr>
+              <w:t>OtherFee</w:t>
+            </w:r>
+            <w:proofErr w:type="spellEnd"/>
+            <w:r>
+              <w:rPr>
+                <w:rFonts w:ascii="Arial" w:hAnsi="Arial" w:cs="Arial"/>
+                <w:sz w:val="18"/>
+                <w:szCs w:val="18"/>
+              </w:rPr>
+              <w:t>}</w:t>
+            </w:r>
+          </w:p>
+        </w:tc>
+      </w:tr>
+      <w:tr>
+        <w:tc>
+          <w:tcPr>
+            <w:tcW w:w="3544" w:type="dxa"/>
+            <w:tcBorders>
+              <w:bottom w:val="single" w:sz="4" w:space="0" w:color="auto"/>
+            </w:tcBorders>
+          </w:tcPr>
+          <w:p>
+            <w:pPr>
+              <w:rPr>
+                <w:rFonts w:ascii="Arial" w:hAnsi="Arial" w:cs="Arial"/>
+                <w:sz w:val="18"/>
+                <w:szCs w:val="18"/>
+              </w:rPr>
+            </w:pPr>
+            <w:r>
+              <w:rPr>
+                <w:rFonts w:ascii="Arial" w:hAnsi="Arial" w:cs="Arial"/>
+                <w:sz w:val="18"/>
+                <w:szCs w:val="18"/>
+              </w:rPr>
+              <w:t>Collection Fees</w:t>
+            </w:r>
+          </w:p>
+        </w:tc>
+        <w:tc>
+          <w:tcPr>
+            <w:tcW w:w="3450" w:type="dxa"/>
+            <w:tcBorders>
+              <w:bottom w:val="single" w:sz="4" w:space="0" w:color="auto"/>
+            </w:tcBorders>
+          </w:tcPr>
+          <w:p>
+            <w:pPr>
+              <w:jc w:val="right"/>
+              <w:rPr>
+                <w:rFonts w:ascii="Arial" w:hAnsi="Arial" w:cs="Arial"/>
+                <w:sz w:val="18"/>
+                <w:szCs w:val="18"/>
+              </w:rPr>
+            </w:pPr>
+          </w:p>
+        </w:tc>
+        <w:tc>
+          <w:tcPr>
+            <w:tcW w:w="3811" w:type="dxa"/>
+            <w:tcBorders>
+              <w:bottom w:val="single" w:sz="4" w:space="0" w:color="auto"/>
+            </w:tcBorders>
+          </w:tcPr>
+          <w:p>
+            <w:pPr>
+              <w:jc w:val="right"/>
+              <w:rPr>
+                <w:rFonts w:ascii="Arial" w:hAnsi="Arial" w:cs="Arial"/>
+                <w:sz w:val="18"/>
+                <w:szCs w:val="18"/>
+              </w:rPr>
+            </w:pPr>
+            <w:r>
+              <w:rPr>
+                <w:rFonts w:ascii="Arial" w:hAnsi="Arial" w:cs="Arial"/>
+                <w:sz w:val="18"/>
+                <w:szCs w:val="18"/>
+              </w:rPr>
+              <w:t>{</w:t>
+            </w:r>
+            <w:proofErr w:type="spellStart"/>
+            <w:r>
+              <w:rPr>
+                <w:rFonts w:ascii="Arial" w:hAnsi="Arial" w:cs="Arial"/>
+                <w:sz w:val="18"/>
+                <w:szCs w:val="18"/>
+              </w:rPr>
+              <w:t>CollectionFee</w:t>
+            </w:r>
+            <w:proofErr w:type="spellEnd"/>
+            <w:r>
+              <w:rPr>
+                <w:rFonts w:ascii="Arial" w:hAnsi="Arial" w:cs="Arial"/>
+                <w:sz w:val="18"/>
+                <w:szCs w:val="18"/>
+              </w:rPr>
+              <w:t>}</w:t>
+            </w:r>
+          </w:p>
+        </w:tc>
+      </w:tr>
+      <w:tr>
+        <w:tc>
+          <w:tcPr>
+            <w:tcW w:w="3544" w:type="dxa"/>
             <w:tcBorders>
               <w:top w:val="single" w:sz="4" w:space="0" w:color="auto"/>
-              <w:left w:val="nil"/>
-              <w:bottom w:val="single" w:sz="4" w:space="0" w:color="auto"/>
-              <w:right w:val="nil"/>
             </w:tcBorders>
           </w:tcPr>
           <w:p>
@@ -1442,50 +2403,35 @@
                 <w:szCs w:val="18"/>
               </w:rPr>
             </w:pPr>
-            <w:r>
-              <w:rPr>
-                <w:rFonts w:ascii="Arial" w:hAnsi="Arial" w:cs="Arial"/>
-                <w:sz w:val="18"/>
-                <w:szCs w:val="18"/>
-              </w:rPr>
-              <w:t xml:space="preserve">Interest </w:t>
-            </w:r>
-          </w:p>
-        </w:tc>
-        <w:tc>
-          <w:tcPr>
-            <w:tcW w:w="3493" w:type="dxa"/>
+          </w:p>
+        </w:tc>
+        <w:tc>
+          <w:tcPr>
+            <w:tcW w:w="3450" w:type="dxa"/>
             <w:tcBorders>
               <w:top w:val="single" w:sz="4" w:space="0" w:color="auto"/>
-              <w:left w:val="nil"/>
-              <w:bottom w:val="single" w:sz="4" w:space="0" w:color="auto"/>
-              <w:right w:val="nil"/>
             </w:tcBorders>
           </w:tcPr>
           <w:p>
             <w:pPr>
-              <w:ind w:left="1633"/>
-              <w:jc w:val="right"/>
-              <w:rPr>
-                <w:rFonts w:ascii="Arial" w:hAnsi="Arial" w:cs="Arial"/>
-                <w:sz w:val="18"/>
-                <w:szCs w:val="18"/>
-              </w:rPr>
-            </w:pPr>
-          </w:p>
-        </w:tc>
-        <w:tc>
-          <w:tcPr>
-            <w:tcW w:w="3468" w:type="dxa"/>
+              <w:rPr>
+                <w:rFonts w:ascii="Arial" w:hAnsi="Arial" w:cs="Arial"/>
+                <w:sz w:val="18"/>
+                <w:szCs w:val="18"/>
+              </w:rPr>
+            </w:pPr>
+          </w:p>
+        </w:tc>
+        <w:tc>
+          <w:tcPr>
+            <w:tcW w:w="3811" w:type="dxa"/>
             <w:tcBorders>
               <w:top w:val="single" w:sz="4" w:space="0" w:color="auto"/>
-              <w:left w:val="nil"/>
-              <w:bottom w:val="single" w:sz="4" w:space="0" w:color="auto"/>
-              <w:right w:val="nil"/>
             </w:tcBorders>
           </w:tcPr>
           <w:p>
             <w:pPr>
+              <w:jc w:val="right"/>
               <w:rPr>
                 <w:rFonts w:ascii="Arial" w:hAnsi="Arial" w:cs="Arial"/>
                 <w:sz w:val="18"/>
@@ -1498,95 +2444,25 @@
       <w:tr>
         <w:tc>
           <w:tcPr>
-            <w:tcW w:w="3505" w:type="dxa"/>
-            <w:tcBorders>
-              <w:top w:val="single" w:sz="4" w:space="0" w:color="auto"/>
-              <w:left w:val="nil"/>
-              <w:bottom w:val="single" w:sz="4" w:space="0" w:color="auto"/>
-              <w:right w:val="nil"/>
-            </w:tcBorders>
-          </w:tcPr>
-          <w:p>
-            <w:pPr>
-              <w:rPr>
-                <w:rFonts w:ascii="Arial" w:hAnsi="Arial" w:cs="Arial"/>
-                <w:sz w:val="14"/>
-                <w:szCs w:val="14"/>
-              </w:rPr>
-            </w:pPr>
-            <w:r>
-              <w:rPr>
-                <w:rFonts w:ascii="Arial" w:hAnsi="Arial" w:cs="Arial"/>
-                <w:sz w:val="18"/>
-                <w:szCs w:val="18"/>
-              </w:rPr>
-              <w:t>Penalty</w:t>
-            </w:r>
-            <w:r>
-              <w:rPr>
-                <w:rFonts w:ascii="Arial" w:hAnsi="Arial" w:cs="Arial"/>
-                <w:sz w:val="14"/>
-                <w:szCs w:val="14"/>
-              </w:rPr>
-              <w:t xml:space="preserve"> </w:t>
-            </w:r>
-          </w:p>
-        </w:tc>
-        <w:tc>
-          <w:tcPr>
-            <w:tcW w:w="3493" w:type="dxa"/>
-            <w:tcBorders>
-              <w:top w:val="single" w:sz="4" w:space="0" w:color="auto"/>
-              <w:left w:val="nil"/>
-              <w:bottom w:val="single" w:sz="4" w:space="0" w:color="auto"/>
-              <w:right w:val="nil"/>
-            </w:tcBorders>
+            <w:tcW w:w="3544" w:type="dxa"/>
+          </w:tcPr>
+          <w:p>
+            <w:pPr>
+              <w:rPr>
+                <w:rFonts w:ascii="Arial" w:hAnsi="Arial" w:cs="Arial"/>
+                <w:sz w:val="18"/>
+                <w:szCs w:val="18"/>
+              </w:rPr>
+            </w:pPr>
+          </w:p>
+        </w:tc>
+        <w:tc>
+          <w:tcPr>
+            <w:tcW w:w="3450" w:type="dxa"/>
           </w:tcPr>
           <w:p>
             <w:pPr>
               <w:jc w:val="right"/>
-              <w:rPr>
-                <w:rFonts w:ascii="Arial" w:hAnsi="Arial" w:cs="Arial"/>
-                <w:sz w:val="18"/>
-                <w:szCs w:val="18"/>
-              </w:rPr>
-            </w:pPr>
-          </w:p>
-        </w:tc>
-        <w:tc>
-          <w:tcPr>
-            <w:tcW w:w="3468" w:type="dxa"/>
-            <w:tcBorders>
-              <w:top w:val="single" w:sz="4" w:space="0" w:color="auto"/>
-              <w:left w:val="nil"/>
-              <w:bottom w:val="single" w:sz="4" w:space="0" w:color="auto"/>
-              <w:right w:val="nil"/>
-            </w:tcBorders>
-          </w:tcPr>
-          <w:p>
-            <w:pPr>
-              <w:rPr>
-                <w:rFonts w:ascii="Arial" w:hAnsi="Arial" w:cs="Arial"/>
-                <w:sz w:val="18"/>
-                <w:szCs w:val="18"/>
-              </w:rPr>
-            </w:pPr>
-          </w:p>
-        </w:tc>
-      </w:tr>
-      <w:tr>
-        <w:tc>
-          <w:tcPr>
-            <w:tcW w:w="3505" w:type="dxa"/>
-            <w:tcBorders>
-              <w:top w:val="single" w:sz="4" w:space="0" w:color="auto"/>
-              <w:left w:val="nil"/>
-              <w:bottom w:val="single" w:sz="4" w:space="0" w:color="auto"/>
-              <w:right w:val="nil"/>
-            </w:tcBorders>
-          </w:tcPr>
-          <w:p>
-            <w:pPr>
               <w:rPr>
                 <w:rFonts w:ascii="Arial" w:hAnsi="Arial" w:cs="Arial"/>
                 <w:b/>
@@ -1603,503 +2479,13 @@
                 <w:sz w:val="18"/>
                 <w:szCs w:val="18"/>
               </w:rPr>
-              <w:t>Total Past Due</w:t>
-            </w:r>
-          </w:p>
-        </w:tc>
-        <w:tc>
-          <w:tcPr>
-            <w:tcW w:w="3493" w:type="dxa"/>
-            <w:tcBorders>
-              <w:top w:val="single" w:sz="4" w:space="0" w:color="auto"/>
-              <w:left w:val="nil"/>
-              <w:bottom w:val="single" w:sz="4" w:space="0" w:color="auto"/>
-              <w:right w:val="nil"/>
-            </w:tcBorders>
-          </w:tcPr>
-          <w:p>
-            <w:pPr>
-              <w:jc w:val="right"/>
-              <w:rPr>
-                <w:rFonts w:ascii="Arial" w:hAnsi="Arial" w:cs="Arial"/>
-                <w:sz w:val="18"/>
-                <w:szCs w:val="18"/>
-              </w:rPr>
-            </w:pPr>
-          </w:p>
-        </w:tc>
-        <w:tc>
-          <w:tcPr>
-            <w:tcW w:w="3468" w:type="dxa"/>
-            <w:tcBorders>
-              <w:top w:val="single" w:sz="4" w:space="0" w:color="auto"/>
-              <w:left w:val="nil"/>
-              <w:bottom w:val="single" w:sz="4" w:space="0" w:color="auto"/>
-              <w:right w:val="nil"/>
-            </w:tcBorders>
-          </w:tcPr>
-          <w:p>
-            <w:pPr>
-              <w:jc w:val="right"/>
-              <w:rPr>
-                <w:rFonts w:ascii="Arial" w:hAnsi="Arial" w:cs="Arial"/>
-                <w:sz w:val="18"/>
-                <w:szCs w:val="18"/>
-              </w:rPr>
-            </w:pPr>
-          </w:p>
-        </w:tc>
-      </w:tr>
-      <w:tr>
-        <w:tc>
-          <w:tcPr>
-            <w:tcW w:w="3505" w:type="dxa"/>
-            <w:tcBorders>
-              <w:top w:val="single" w:sz="4" w:space="0" w:color="auto"/>
-              <w:left w:val="nil"/>
-              <w:bottom w:val="single" w:sz="4" w:space="0" w:color="auto"/>
-              <w:right w:val="nil"/>
-            </w:tcBorders>
-          </w:tcPr>
-          <w:p>
-            <w:pPr>
-              <w:rPr>
-                <w:rFonts w:ascii="Arial" w:hAnsi="Arial" w:cs="Arial"/>
-                <w:sz w:val="18"/>
-                <w:szCs w:val="18"/>
-              </w:rPr>
-            </w:pPr>
-          </w:p>
-          <w:p>
-            <w:pPr>
-              <w:rPr>
-                <w:rFonts w:ascii="Arial" w:hAnsi="Arial" w:cs="Arial"/>
-                <w:b/>
-                <w:bCs/>
-                <w:sz w:val="18"/>
-                <w:szCs w:val="18"/>
-              </w:rPr>
-            </w:pPr>
-            <w:r>
-              <w:rPr>
-                <w:rFonts w:ascii="Arial" w:hAnsi="Arial" w:cs="Arial"/>
-                <w:b/>
-                <w:bCs/>
-                <w:sz w:val="18"/>
-                <w:szCs w:val="18"/>
-              </w:rPr>
-              <w:t>Additional Charges</w:t>
-            </w:r>
-          </w:p>
-        </w:tc>
-        <w:tc>
-          <w:tcPr>
-            <w:tcW w:w="3493" w:type="dxa"/>
-            <w:tcBorders>
-              <w:top w:val="single" w:sz="4" w:space="0" w:color="auto"/>
-              <w:left w:val="nil"/>
-              <w:bottom w:val="single" w:sz="4" w:space="0" w:color="auto"/>
-              <w:right w:val="nil"/>
-            </w:tcBorders>
-          </w:tcPr>
-          <w:p>
-            <w:pPr>
-              <w:jc w:val="right"/>
-              <w:rPr>
-                <w:rFonts w:ascii="Arial" w:hAnsi="Arial" w:cs="Arial"/>
-                <w:sz w:val="18"/>
-                <w:szCs w:val="18"/>
-              </w:rPr>
-            </w:pPr>
-          </w:p>
-        </w:tc>
-        <w:tc>
-          <w:tcPr>
-            <w:tcW w:w="3468" w:type="dxa"/>
-            <w:tcBorders>
-              <w:top w:val="single" w:sz="4" w:space="0" w:color="auto"/>
-              <w:left w:val="nil"/>
-              <w:bottom w:val="single" w:sz="4" w:space="0" w:color="auto"/>
-              <w:right w:val="nil"/>
-            </w:tcBorders>
-          </w:tcPr>
-          <w:p>
-            <w:pPr>
-              <w:rPr>
-                <w:rFonts w:ascii="Arial" w:hAnsi="Arial" w:cs="Arial"/>
-                <w:sz w:val="18"/>
-                <w:szCs w:val="18"/>
-              </w:rPr>
-            </w:pPr>
-          </w:p>
-        </w:tc>
-      </w:tr>
-      <w:tr>
-        <w:tc>
-          <w:tcPr>
-            <w:tcW w:w="3505" w:type="dxa"/>
-            <w:tcBorders>
-              <w:top w:val="single" w:sz="4" w:space="0" w:color="auto"/>
-              <w:left w:val="nil"/>
-              <w:bottom w:val="single" w:sz="4" w:space="0" w:color="auto"/>
-              <w:right w:val="nil"/>
-            </w:tcBorders>
-          </w:tcPr>
-          <w:p>
-            <w:pPr>
-              <w:rPr>
-                <w:rFonts w:ascii="Arial" w:hAnsi="Arial" w:cs="Arial"/>
-                <w:sz w:val="18"/>
-                <w:szCs w:val="18"/>
-              </w:rPr>
-            </w:pPr>
-            <w:r>
-              <w:rPr>
-                <w:rFonts w:ascii="Arial" w:hAnsi="Arial" w:cs="Arial"/>
-                <w:sz w:val="18"/>
-                <w:szCs w:val="18"/>
-              </w:rPr>
-              <w:t>Accrued Interest</w:t>
-            </w:r>
-            <w:r>
-              <w:rPr>
-                <w:rFonts w:ascii="Arial" w:hAnsi="Arial" w:cs="Arial"/>
-                <w:sz w:val="18"/>
-                <w:szCs w:val="18"/>
-              </w:rPr>
-              <w:t xml:space="preserve"> </w:t>
-            </w:r>
-            <w:r>
-              <w:rPr>
-                <w:rFonts w:ascii="Arial" w:hAnsi="Arial" w:cs="Arial"/>
-                <w:sz w:val="14"/>
-                <w:szCs w:val="14"/>
-              </w:rPr>
-              <w:t xml:space="preserve">    </w:t>
-            </w:r>
-          </w:p>
-        </w:tc>
-        <w:tc>
-          <w:tcPr>
-            <w:tcW w:w="3493" w:type="dxa"/>
-            <w:tcBorders>
-              <w:top w:val="single" w:sz="4" w:space="0" w:color="auto"/>
-              <w:left w:val="nil"/>
-              <w:bottom w:val="single" w:sz="4" w:space="0" w:color="auto"/>
-              <w:right w:val="nil"/>
-            </w:tcBorders>
-          </w:tcPr>
-          <w:p>
-            <w:pPr>
-              <w:jc w:val="right"/>
-              <w:rPr>
-                <w:rFonts w:ascii="Arial" w:hAnsi="Arial" w:cs="Arial"/>
-                <w:sz w:val="18"/>
-                <w:szCs w:val="18"/>
-              </w:rPr>
-            </w:pPr>
-          </w:p>
-        </w:tc>
-        <w:tc>
-          <w:tcPr>
-            <w:tcW w:w="3468" w:type="dxa"/>
-            <w:tcBorders>
-              <w:top w:val="single" w:sz="4" w:space="0" w:color="auto"/>
-              <w:left w:val="nil"/>
-              <w:bottom w:val="single" w:sz="4" w:space="0" w:color="auto"/>
-              <w:right w:val="nil"/>
-            </w:tcBorders>
-          </w:tcPr>
-          <w:p>
-            <w:pPr>
-              <w:jc w:val="right"/>
-              <w:rPr>
-                <w:rFonts w:ascii="Arial" w:hAnsi="Arial" w:cs="Arial"/>
-                <w:sz w:val="18"/>
-                <w:szCs w:val="18"/>
-              </w:rPr>
-            </w:pPr>
-          </w:p>
-        </w:tc>
-      </w:tr>
-      <w:tr>
-        <w:tc>
-          <w:tcPr>
-            <w:tcW w:w="3505" w:type="dxa"/>
-            <w:tcBorders>
-              <w:top w:val="single" w:sz="4" w:space="0" w:color="auto"/>
-              <w:left w:val="nil"/>
-              <w:bottom w:val="single" w:sz="4" w:space="0" w:color="auto"/>
-              <w:right w:val="nil"/>
-            </w:tcBorders>
-          </w:tcPr>
-          <w:p>
-            <w:pPr>
-              <w:rPr>
-                <w:rFonts w:ascii="Arial" w:hAnsi="Arial" w:cs="Arial"/>
-                <w:sz w:val="18"/>
-                <w:szCs w:val="18"/>
-              </w:rPr>
-            </w:pPr>
-            <w:r>
-              <w:rPr>
-                <w:rFonts w:ascii="Arial" w:hAnsi="Arial" w:cs="Arial"/>
-                <w:sz w:val="18"/>
-                <w:szCs w:val="18"/>
-              </w:rPr>
-              <w:t xml:space="preserve">Other </w:t>
-            </w:r>
-            <w:r>
-              <w:rPr>
-                <w:rFonts w:ascii="Arial" w:hAnsi="Arial" w:cs="Arial"/>
-                <w:sz w:val="18"/>
-                <w:szCs w:val="18"/>
-              </w:rPr>
-              <w:t>Fees</w:t>
-            </w:r>
-          </w:p>
-        </w:tc>
-        <w:tc>
-          <w:tcPr>
-            <w:tcW w:w="3493" w:type="dxa"/>
-            <w:tcBorders>
-              <w:top w:val="single" w:sz="4" w:space="0" w:color="auto"/>
-              <w:left w:val="nil"/>
-              <w:bottom w:val="single" w:sz="4" w:space="0" w:color="auto"/>
-              <w:right w:val="nil"/>
-            </w:tcBorders>
-          </w:tcPr>
-          <w:p>
-            <w:pPr>
-              <w:jc w:val="right"/>
-              <w:rPr>
-                <w:rFonts w:ascii="Arial" w:hAnsi="Arial" w:cs="Arial"/>
-                <w:sz w:val="18"/>
-                <w:szCs w:val="18"/>
-              </w:rPr>
-            </w:pPr>
-          </w:p>
-        </w:tc>
-        <w:tc>
-          <w:tcPr>
-            <w:tcW w:w="3468" w:type="dxa"/>
-            <w:tcBorders>
-              <w:top w:val="single" w:sz="4" w:space="0" w:color="auto"/>
-              <w:left w:val="nil"/>
-              <w:bottom w:val="single" w:sz="4" w:space="0" w:color="auto"/>
-              <w:right w:val="nil"/>
-            </w:tcBorders>
-          </w:tcPr>
-          <w:p>
-            <w:pPr>
-              <w:jc w:val="right"/>
-              <w:rPr>
-                <w:rFonts w:ascii="Arial" w:hAnsi="Arial" w:cs="Arial"/>
-                <w:sz w:val="18"/>
-                <w:szCs w:val="18"/>
-              </w:rPr>
-            </w:pPr>
-          </w:p>
-        </w:tc>
-      </w:tr>
-      <w:tr>
-        <w:tc>
-          <w:tcPr>
-            <w:tcW w:w="3505" w:type="dxa"/>
-            <w:tcBorders>
-              <w:top w:val="single" w:sz="4" w:space="0" w:color="auto"/>
-              <w:left w:val="nil"/>
-              <w:bottom w:val="single" w:sz="4" w:space="0" w:color="auto"/>
-              <w:right w:val="nil"/>
-            </w:tcBorders>
-          </w:tcPr>
-          <w:p>
-            <w:pPr>
-              <w:rPr>
-                <w:rFonts w:ascii="Arial" w:hAnsi="Arial" w:cs="Arial"/>
-                <w:sz w:val="18"/>
-                <w:szCs w:val="18"/>
-              </w:rPr>
-            </w:pPr>
-            <w:r>
-              <w:rPr>
-                <w:rFonts w:ascii="Arial" w:hAnsi="Arial" w:cs="Arial"/>
-                <w:sz w:val="18"/>
-                <w:szCs w:val="18"/>
-              </w:rPr>
-              <w:t>Collection Fees</w:t>
-            </w:r>
-          </w:p>
-        </w:tc>
-        <w:tc>
-          <w:tcPr>
-            <w:tcW w:w="3493" w:type="dxa"/>
-            <w:tcBorders>
-              <w:top w:val="single" w:sz="4" w:space="0" w:color="auto"/>
-              <w:left w:val="nil"/>
-              <w:bottom w:val="single" w:sz="4" w:space="0" w:color="auto"/>
-              <w:right w:val="nil"/>
-            </w:tcBorders>
-          </w:tcPr>
-          <w:p>
-            <w:pPr>
-              <w:jc w:val="right"/>
-              <w:rPr>
-                <w:rFonts w:ascii="Arial" w:hAnsi="Arial" w:cs="Arial"/>
-                <w:sz w:val="18"/>
-                <w:szCs w:val="18"/>
-              </w:rPr>
-            </w:pPr>
-          </w:p>
-        </w:tc>
-        <w:tc>
-          <w:tcPr>
-            <w:tcW w:w="3468" w:type="dxa"/>
-            <w:tcBorders>
-              <w:top w:val="single" w:sz="4" w:space="0" w:color="auto"/>
-              <w:left w:val="nil"/>
-              <w:bottom w:val="single" w:sz="4" w:space="0" w:color="auto"/>
-              <w:right w:val="nil"/>
-            </w:tcBorders>
-          </w:tcPr>
-          <w:p>
-            <w:pPr>
-              <w:jc w:val="right"/>
-              <w:rPr>
-                <w:rFonts w:ascii="Arial" w:hAnsi="Arial" w:cs="Arial"/>
-                <w:sz w:val="18"/>
-                <w:szCs w:val="18"/>
-              </w:rPr>
-            </w:pPr>
-          </w:p>
-        </w:tc>
-      </w:tr>
-      <w:tr>
-        <w:tc>
-          <w:tcPr>
-            <w:tcW w:w="3505" w:type="dxa"/>
-            <w:tcBorders>
-              <w:top w:val="single" w:sz="4" w:space="0" w:color="auto"/>
-              <w:left w:val="nil"/>
-              <w:bottom w:val="nil"/>
-              <w:right w:val="nil"/>
-            </w:tcBorders>
-          </w:tcPr>
-          <w:p>
-            <w:pPr>
-              <w:rPr>
-                <w:rFonts w:ascii="Arial" w:hAnsi="Arial" w:cs="Arial"/>
-                <w:sz w:val="18"/>
-                <w:szCs w:val="18"/>
-              </w:rPr>
-            </w:pPr>
-          </w:p>
-        </w:tc>
-        <w:tc>
-          <w:tcPr>
-            <w:tcW w:w="3493" w:type="dxa"/>
-            <w:tcBorders>
-              <w:top w:val="single" w:sz="4" w:space="0" w:color="auto"/>
-              <w:left w:val="nil"/>
-              <w:bottom w:val="nil"/>
-              <w:right w:val="nil"/>
-            </w:tcBorders>
-          </w:tcPr>
-          <w:p>
-            <w:pPr>
-              <w:rPr>
-                <w:rFonts w:ascii="Arial" w:hAnsi="Arial" w:cs="Arial"/>
-                <w:sz w:val="18"/>
-                <w:szCs w:val="18"/>
-              </w:rPr>
-            </w:pPr>
-          </w:p>
-        </w:tc>
-        <w:tc>
-          <w:tcPr>
-            <w:tcW w:w="3468" w:type="dxa"/>
-            <w:tcBorders>
-              <w:top w:val="single" w:sz="4" w:space="0" w:color="auto"/>
-              <w:left w:val="nil"/>
-              <w:bottom w:val="single" w:sz="6" w:space="0" w:color="auto"/>
-              <w:right w:val="nil"/>
-            </w:tcBorders>
-          </w:tcPr>
-          <w:p>
-            <w:pPr>
-              <w:jc w:val="right"/>
-              <w:rPr>
-                <w:rFonts w:ascii="Arial" w:hAnsi="Arial" w:cs="Arial"/>
-                <w:sz w:val="18"/>
-                <w:szCs w:val="18"/>
-              </w:rPr>
-            </w:pPr>
-          </w:p>
-        </w:tc>
-      </w:tr>
-      <w:tr>
-        <w:tc>
-          <w:tcPr>
-            <w:tcW w:w="3505" w:type="dxa"/>
-            <w:tcBorders>
-              <w:top w:val="nil"/>
-              <w:left w:val="nil"/>
-              <w:bottom w:val="nil"/>
-              <w:right w:val="nil"/>
-            </w:tcBorders>
-          </w:tcPr>
-          <w:p>
-            <w:pPr>
-              <w:rPr>
-                <w:rFonts w:ascii="Arial" w:hAnsi="Arial" w:cs="Arial"/>
-                <w:sz w:val="18"/>
-                <w:szCs w:val="18"/>
-              </w:rPr>
-            </w:pPr>
-          </w:p>
-        </w:tc>
-        <w:tc>
-          <w:tcPr>
-            <w:tcW w:w="3493" w:type="dxa"/>
-            <w:tcBorders>
-              <w:top w:val="nil"/>
-              <w:left w:val="nil"/>
-              <w:bottom w:val="nil"/>
-              <w:right w:val="nil"/>
-            </w:tcBorders>
-          </w:tcPr>
-          <w:p>
-            <w:pPr>
-              <w:jc w:val="right"/>
-              <w:rPr>
-                <w:rFonts w:ascii="Arial" w:hAnsi="Arial" w:cs="Arial"/>
-                <w:b/>
-                <w:bCs/>
-                <w:sz w:val="18"/>
-                <w:szCs w:val="18"/>
-              </w:rPr>
-            </w:pPr>
-            <w:r>
-              <w:rPr>
-                <w:rFonts w:ascii="Arial" w:hAnsi="Arial" w:cs="Arial"/>
-                <w:b/>
-                <w:bCs/>
-                <w:sz w:val="18"/>
-                <w:szCs w:val="18"/>
-              </w:rPr>
               <w:t>Total Amount Due</w:t>
             </w:r>
           </w:p>
         </w:tc>
         <w:tc>
           <w:tcPr>
-            <w:tcW w:w="3468" w:type="dxa"/>
-            <w:tcBorders>
-              <w:top w:val="single" w:sz="6" w:space="0" w:color="auto"/>
-              <w:left w:val="nil"/>
-              <w:bottom w:val="single" w:sz="6" w:space="0" w:color="auto"/>
-              <w:right w:val="nil"/>
-            </w:tcBorders>
+            <w:tcW w:w="3811" w:type="dxa"/>
           </w:tcPr>
           <w:p>
             <w:pPr>
@@ -2111,6 +2497,32 @@
                 <w:szCs w:val="18"/>
               </w:rPr>
             </w:pPr>
+            <w:r>
+              <w:rPr>
+                <w:rFonts w:ascii="Arial" w:hAnsi="Arial" w:cs="Arial"/>
+                <w:sz w:val="18"/>
+                <w:szCs w:val="18"/>
+              </w:rPr>
+              <w:t>{</w:t>
+            </w:r>
+            <w:proofErr w:type="spellStart"/>
+            <w:r>
+              <w:rPr>
+                <w:rFonts w:ascii="Arial" w:hAnsi="Arial" w:cs="Arial"/>
+                <w:sz w:val="18"/>
+                <w:szCs w:val="18"/>
+              </w:rPr>
+              <w:t>TotalAmountDue</w:t>
+            </w:r>
+            <w:proofErr w:type="spellEnd"/>
+            <w:r>
+              <w:rPr>
+                <w:rFonts w:ascii="Arial" w:hAnsi="Arial" w:cs="Arial"/>
+                <w:sz w:val="18"/>
+                <w:szCs w:val="18"/>
+              </w:rPr>
+              <w:t>}</w:t>
+            </w:r>
           </w:p>
         </w:tc>
       </w:tr>
@@ -2132,8 +2544,8 @@
           <w:bCs/>
           <w:i/>
           <w:iCs/>
-          <w:sz w:val="18"/>
-          <w:szCs w:val="18"/>
+          <w:sz w:val="16"/>
+          <w:szCs w:val="16"/>
         </w:rPr>
       </w:pPr>
       <w:r>
@@ -2206,8 +2618,8 @@
           <w:bCs/>
           <w:i/>
           <w:iCs/>
-          <w:sz w:val="18"/>
-          <w:szCs w:val="18"/>
+          <w:sz w:val="14"/>
+          <w:szCs w:val="14"/>
         </w:rPr>
         <w:t>Please pay immediately to avoid penalties and charges</w:t>
       </w:r>
@@ -2233,18 +2645,19 @@
       <w:tblPr>
         <w:tblStyle w:val="TableGrid"/>
         <w:tblW w:w="0" w:type="auto"/>
+        <w:tblLayout w:type="fixed"/>
         <w:tblLook w:val="04A0" w:firstRow="1" w:lastRow="0" w:firstColumn="1" w:lastColumn="0" w:noHBand="0" w:noVBand="1"/>
       </w:tblPr>
       <w:tblGrid>
-        <w:gridCol w:w="846"/>
-        <w:gridCol w:w="600"/>
+        <w:gridCol w:w="1413"/>
         <w:gridCol w:w="992"/>
-        <w:gridCol w:w="960"/>
+        <w:gridCol w:w="851"/>
+        <w:gridCol w:w="1134"/>
       </w:tblGrid>
       <w:tr>
         <w:tc>
           <w:tcPr>
-            <w:tcW w:w="846" w:type="dxa"/>
+            <w:tcW w:w="1413" w:type="dxa"/>
           </w:tcPr>
           <w:p>
             <w:pPr>
@@ -2267,7 +2680,7 @@
         </w:tc>
         <w:tc>
           <w:tcPr>
-            <w:tcW w:w="316" w:type="dxa"/>
+            <w:tcW w:w="992" w:type="dxa"/>
           </w:tcPr>
           <w:p>
             <w:pPr>
@@ -2290,7 +2703,7 @@
         </w:tc>
         <w:tc>
           <w:tcPr>
-            <w:tcW w:w="992" w:type="dxa"/>
+            <w:tcW w:w="851" w:type="dxa"/>
           </w:tcPr>
           <w:p>
             <w:pPr>
@@ -2313,7 +2726,7 @@
         </w:tc>
         <w:tc>
           <w:tcPr>
-            <w:tcW w:w="960" w:type="dxa"/>
+            <w:tcW w:w="1134" w:type="dxa"/>
           </w:tcPr>
           <w:p>
             <w:pPr>
@@ -2331,19 +2744,193 @@
                 <w:szCs w:val="10"/>
               </w:rPr>
               <w:t>Total due</w:t>
+            </w:r>
+          </w:p>
+        </w:tc>
+      </w:tr>
+      <w:tr>
+        <w:tc>
+          <w:tcPr>
+            <w:tcW w:w="1413" w:type="dxa"/>
+          </w:tcPr>
+          <w:p>
+            <w:pPr>
+              <w:jc w:val="center"/>
+              <w:rPr>
+                <w:rFonts w:ascii="Arial" w:hAnsi="Arial" w:cs="Arial"/>
+                <w:sz w:val="10"/>
+                <w:szCs w:val="10"/>
+              </w:rPr>
+            </w:pPr>
+            <w:r>
+              <w:rPr>
+                <w:rFonts w:ascii="Arial" w:hAnsi="Arial" w:cs="Arial"/>
+                <w:sz w:val="10"/>
+                <w:szCs w:val="10"/>
+              </w:rPr>
+              <w:t>{#</w:t>
+            </w:r>
+            <w:proofErr w:type="gramStart"/>
+            <w:r>
+              <w:rPr>
+                <w:rFonts w:ascii="Arial" w:hAnsi="Arial" w:cs="Arial"/>
+                <w:sz w:val="10"/>
+                <w:szCs w:val="10"/>
+              </w:rPr>
+              <w:t>RemainingSchedule}{</w:t>
+            </w:r>
+            <w:proofErr w:type="gramEnd"/>
+            <w:r>
+              <w:rPr>
+                <w:rFonts w:ascii="Arial" w:hAnsi="Arial" w:cs="Arial"/>
+                <w:sz w:val="10"/>
+                <w:szCs w:val="10"/>
+              </w:rPr>
+              <w:t>DueDate}</w:t>
+            </w:r>
+          </w:p>
+        </w:tc>
+        <w:tc>
+          <w:tcPr>
+            <w:tcW w:w="992" w:type="dxa"/>
+          </w:tcPr>
+          <w:p>
+            <w:pPr>
+              <w:jc w:val="center"/>
+              <w:rPr>
+                <w:rFonts w:ascii="Arial" w:hAnsi="Arial" w:cs="Arial"/>
+                <w:sz w:val="10"/>
+                <w:szCs w:val="10"/>
+              </w:rPr>
+            </w:pPr>
+            <w:r>
+              <w:rPr>
+                <w:rFonts w:ascii="Arial" w:hAnsi="Arial" w:cs="Arial"/>
+                <w:sz w:val="10"/>
+                <w:szCs w:val="10"/>
+              </w:rPr>
+              <w:t>{Principal}</w:t>
+            </w:r>
+          </w:p>
+        </w:tc>
+        <w:tc>
+          <w:tcPr>
+            <w:tcW w:w="851" w:type="dxa"/>
+          </w:tcPr>
+          <w:p>
+            <w:pPr>
+              <w:jc w:val="center"/>
+              <w:rPr>
+                <w:rFonts w:ascii="Arial" w:hAnsi="Arial" w:cs="Arial"/>
+                <w:sz w:val="10"/>
+                <w:szCs w:val="10"/>
+              </w:rPr>
+            </w:pPr>
+            <w:r>
+              <w:rPr>
+                <w:rFonts w:ascii="Arial" w:hAnsi="Arial" w:cs="Arial"/>
+                <w:sz w:val="10"/>
+                <w:szCs w:val="10"/>
+              </w:rPr>
+              <w:t>{Interest}</w:t>
+            </w:r>
+          </w:p>
+        </w:tc>
+        <w:tc>
+          <w:tcPr>
+            <w:tcW w:w="1134" w:type="dxa"/>
+          </w:tcPr>
+          <w:p>
+            <w:pPr>
+              <w:jc w:val="center"/>
+              <w:rPr>
+                <w:rFonts w:ascii="Arial" w:hAnsi="Arial" w:cs="Arial"/>
+                <w:sz w:val="10"/>
+                <w:szCs w:val="10"/>
+              </w:rPr>
+            </w:pPr>
+            <w:r>
+              <w:rPr>
+                <w:rFonts w:ascii="Arial" w:hAnsi="Arial" w:cs="Arial"/>
+                <w:sz w:val="10"/>
+                <w:szCs w:val="10"/>
+              </w:rPr>
+              <w:t>{</w:t>
+            </w:r>
+            <w:proofErr w:type="spellStart"/>
+            <w:r>
+              <w:rPr>
+                <w:rFonts w:ascii="Arial" w:hAnsi="Arial" w:cs="Arial"/>
+                <w:sz w:val="10"/>
+                <w:szCs w:val="10"/>
+              </w:rPr>
+              <w:t>TotalDue</w:t>
+            </w:r>
+            <w:proofErr w:type="spellEnd"/>
+            <w:r>
+              <w:rPr>
+                <w:rFonts w:ascii="Arial" w:hAnsi="Arial" w:cs="Arial"/>
+                <w:sz w:val="10"/>
+                <w:szCs w:val="10"/>
+              </w:rPr>
+              <w:t>}{/</w:t>
+            </w:r>
+            <w:proofErr w:type="spellStart"/>
+            <w:r>
+              <w:rPr>
+                <w:rFonts w:ascii="Arial" w:hAnsi="Arial" w:cs="Arial"/>
+                <w:sz w:val="10"/>
+                <w:szCs w:val="10"/>
+              </w:rPr>
+              <w:t>RemainingSchedule</w:t>
+            </w:r>
+            <w:proofErr w:type="spellEnd"/>
+            <w:r>
+              <w:rPr>
+                <w:rFonts w:ascii="Arial" w:hAnsi="Arial" w:cs="Arial"/>
+                <w:sz w:val="10"/>
+                <w:szCs w:val="10"/>
+              </w:rPr>
+              <w:t>}</w:t>
             </w:r>
           </w:p>
         </w:tc>
       </w:tr>
     </w:tbl>
     <w:p>
-      <w:pPr>
+      <w:r>
         <w:rPr>
           <w:rFonts w:ascii="Arial" w:hAnsi="Arial" w:cs="Arial"/>
-          <w:sz w:val="18"/>
-          <w:szCs w:val="18"/>
+          <w:sz w:val="10"/>
+          <w:szCs w:val="10"/>
         </w:rPr>
-      </w:pPr>
+        <w:tab/>
+      </w:r>
+      <w:r>
+        <w:rPr>
+          <w:rFonts w:ascii="Arial" w:hAnsi="Arial" w:cs="Arial"/>
+          <w:sz w:val="10"/>
+          <w:szCs w:val="10"/>
+        </w:rPr>
+        <w:tab/>
+      </w:r>
+      <w:r>
+        <w:rPr>
+          <w:rFonts w:ascii="Arial" w:hAnsi="Arial" w:cs="Arial"/>
+          <w:sz w:val="10"/>
+          <w:szCs w:val="10"/>
+        </w:rPr>
+        <w:tab/>
+      </w:r>
+      <w:r>
+        <w:tab/>
+      </w:r>
+      <w:r>
+        <w:tab/>
+      </w:r>
+      <w:r>
+        <w:tab/>
+      </w:r>
     </w:p>
     <w:tbl>
       <w:tblPr>

</xml_diff>